<commit_message>
docs(requirements): point the late-answer sentence fix to #81 (#6)
#81 (intent_json owner) now carries the fix, so the SRD names it
instead of the interface alignment PR.

Co-Authored-By: Claude Opus 5.5 <noreply@anthropic.com>
</commit_message>
<xml_diff>
--- a/docs/requirements/srd/word/01_VOSS_SRD_v0.4.docx
+++ b/docs/requirements/srd/word/01_VOSS_SRD_v0.4.docx
@@ -13253,7 +13253,7 @@
         <w:pStyle w:val="BodyText"/>
       </w:pPr>
       <w:r>
-        <w:t xml:space="preserve">기본 질문 ID는 box_id다. 현재 ASKING·같은 ID·후보2동 또는 HOLD만 수용한다. 30초 타이머는 manager say 발행부터 시작한다. 무효 답은1회 재안내하고 타이머를 유지한다. TTS가 실패해도 HMI 질문을 표시하며 타이머는 진행한다. stop에서 멈추고 resume은 재발화와30초 재시작이다. 종료된 같은 box의 질문 회차·늦은 답 수락 창 전달은 B 상세로 남긴다. box_id#회차를 원래 투입 ID에 혼합하지 않는다. main intent_json.md에 남은 "앞 질문의 늦은 답이 와도 같은 박스의 답이라 해가 없고" 문장은 #54 최종 정정과 맞지 않아 인터페이스 정합 PR에서 고친다(F-09). human_wait는 say→유효 답 또는timeout 구간으로 별도 기록한다.</w:t>
+        <w:t xml:space="preserve">기본 질문 ID는 box_id다. 현재 ASKING·같은 ID·후보2동 또는 HOLD만 수용한다. 30초 타이머는 manager say 발행부터 시작한다. 무효 답은1회 재안내하고 타이머를 유지한다. TTS가 실패해도 HMI 질문을 표시하며 타이머는 진행한다. stop에서 멈추고 resume은 재발화와30초 재시작이다. 종료된 같은 box의 질문 회차·늦은 답 수락 창 전달은 B 상세로 남긴다. box_id#회차를 원래 투입 ID에 혼합하지 않는다. main intent_json.md에 남은 "앞 질문의 늦은 답이 와도 같은 박스의 답이라 해가 없고" 문장은 #54 최종 정정과 맞지 않아 정의석 PR #81에서 고친다(F-09). human_wait는 say→유효 답 또는timeout 구간으로 별도 기록한다.</w:t>
       </w:r>
     </w:p>
     <w:p>
@@ -30829,7 +30829,7 @@
                 <w:rFonts w:ascii="Noto Sans CJK KR" w:hAnsi="Noto Sans CJK KR" w:eastAsia="Noto Sans CJK KR"/>
                 <w:sz w:val="18"/>
               </w:rPr>
-              <w:t xml:space="preserve">"늦은 답이 와도 같은 박스의 답이라 해가 없고" 문장을 #54 최종 정정에 맞게 고치기(인터페이스 정합 PR)·consumer rebuild</w:t>
+              <w:t xml:space="preserve">"늦은 답이 와도 같은 박스의 답이라 해가 없고" 문장을 #54 최종 정정에 맞게 고치기(정의석 PR #81)·consumer rebuild</w:t>
             </w:r>
           </w:p>
         </w:tc>

</xml_diff>